<commit_message>
Nueva version del algoritmo divide y venceras
</commit_message>
<xml_diff>
--- a/p3/p3/Practica 4.docx
+++ b/p3/p3/Practica 4.docx
@@ -6186,7 +6186,15 @@
                 <w:sz w:val="36"/>
                 <w:szCs w:val="36"/>
               </w:rPr>
-              <w:t>29</w:t>
+              <w:t>2</w:t>
+            </w:r>
+            <w:r>
+              <w:rPr>
+                <w:rFonts w:ascii="Times New Roman" w:hAnsi="Times New Roman" w:cs="Times New Roman"/>
+                <w:sz w:val="36"/>
+                <w:szCs w:val="36"/>
+              </w:rPr>
+              <w:t>0</w:t>
             </w:r>
           </w:p>
         </w:tc>
@@ -6232,7 +6240,7 @@
                 <w:sz w:val="36"/>
                 <w:szCs w:val="36"/>
               </w:rPr>
-              <w:t>20</w:t>
+              <w:t>4</w:t>
             </w:r>
           </w:p>
         </w:tc>
@@ -6278,7 +6286,7 @@
                 <w:sz w:val="36"/>
                 <w:szCs w:val="36"/>
               </w:rPr>
-              <w:t>54</w:t>
+              <w:t>8</w:t>
             </w:r>
           </w:p>
         </w:tc>
@@ -6324,7 +6332,15 @@
                 <w:sz w:val="36"/>
                 <w:szCs w:val="36"/>
               </w:rPr>
-              <w:t>199</w:t>
+              <w:t>1</w:t>
+            </w:r>
+            <w:r>
+              <w:rPr>
+                <w:rFonts w:ascii="Times New Roman" w:hAnsi="Times New Roman" w:cs="Times New Roman"/>
+                <w:sz w:val="36"/>
+                <w:szCs w:val="36"/>
+              </w:rPr>
+              <w:t>1</w:t>
             </w:r>
           </w:p>
         </w:tc>
@@ -6370,7 +6386,15 @@
                 <w:sz w:val="36"/>
                 <w:szCs w:val="36"/>
               </w:rPr>
-              <w:t>248</w:t>
+              <w:t>2</w:t>
+            </w:r>
+            <w:r>
+              <w:rPr>
+                <w:rFonts w:ascii="Times New Roman" w:hAnsi="Times New Roman" w:cs="Times New Roman"/>
+                <w:sz w:val="36"/>
+                <w:szCs w:val="36"/>
+              </w:rPr>
+              <w:t>0</w:t>
             </w:r>
           </w:p>
         </w:tc>
@@ -6416,7 +6440,7 @@
                 <w:sz w:val="36"/>
                 <w:szCs w:val="36"/>
               </w:rPr>
-              <w:t>950</w:t>
+              <w:t>47</w:t>
             </w:r>
           </w:p>
         </w:tc>
@@ -6462,7 +6486,7 @@
                 <w:sz w:val="36"/>
                 <w:szCs w:val="36"/>
               </w:rPr>
-              <w:t>3679</w:t>
+              <w:t>52</w:t>
             </w:r>
           </w:p>
         </w:tc>
@@ -6508,7 +6532,7 @@
                 <w:sz w:val="36"/>
                 <w:szCs w:val="36"/>
               </w:rPr>
-              <w:t>10016</w:t>
+              <w:t>96</w:t>
             </w:r>
           </w:p>
         </w:tc>
@@ -6546,15 +6570,16 @@
                 <w:rFonts w:ascii="Times New Roman" w:hAnsi="Times New Roman" w:cs="Times New Roman"/>
                 <w:sz w:val="36"/>
                 <w:szCs w:val="36"/>
-              </w:rPr>
-            </w:pPr>
-            <w:r>
-              <w:rPr>
-                <w:rFonts w:ascii="Times New Roman" w:hAnsi="Times New Roman" w:cs="Times New Roman"/>
-                <w:sz w:val="36"/>
-                <w:szCs w:val="36"/>
-              </w:rPr>
-              <w:t>77357</w:t>
+                <w:u w:val="single"/>
+              </w:rPr>
+            </w:pPr>
+            <w:r>
+              <w:rPr>
+                <w:rFonts w:ascii="Times New Roman" w:hAnsi="Times New Roman" w:cs="Times New Roman"/>
+                <w:sz w:val="36"/>
+                <w:szCs w:val="36"/>
+              </w:rPr>
+              <w:t>389</w:t>
             </w:r>
           </w:p>
         </w:tc>
@@ -7375,6 +7400,7 @@
   <w:style w:type="character" w:default="1" w:styleId="Fuentedeprrafopredeter">
     <w:name w:val="Default Paragraph Font"/>
     <w:uiPriority w:val="1"/>
+    <w:semiHidden/>
     <w:unhideWhenUsed/>
   </w:style>
   <w:style w:type="table" w:default="1" w:styleId="Tablanormal">

</xml_diff>